<commit_message>
artifacts: tvist.api rebrand + live URL; commit PDF generators
</commit_message>
<xml_diff>
--- a/assets/Tvist-Executive-Summary.docx
+++ b/assets/Tvist-Executive-Summary.docx
@@ -24,7 +24,7 @@
           <w:sz w:val="56"/>
           <w:szCs w:val="56"/>
         </w:rPr>
-        <w:t xml:space="preserve">.ai</w:t>
+        <w:t xml:space="preserve">.api</w:t>
       </w:r>
       <w:r>
         <w:rPr>
@@ -6348,6 +6348,23 @@
           <w:szCs w:val="21"/>
         </w:rPr>
         <w:t xml:space="preserve">Complementary, not competitive: to networks (we operationalize their intent standards), to custody providers (we are their missing rules engine), and to agent platforms (we are the trust layer their checkout protocols defer). The wedge is the cross-section nobody owns — and it compounds: every new rail, protocol, and jurisdiction added to the registry makes the layer harder to replicate.</w:t>
+      </w:r>
+    </w:p>
+    <w:p>
+      <w:r>
+        <w:rPr>
+          <w:b/>
+          <w:color w:val="0F766E"/>
+          <w:sz w:val="21"/>
+        </w:rPr>
+        <w:t xml:space="preserve">Live: </w:t>
+      </w:r>
+      <w:r>
+        <w:rPr>
+          <w:sz w:val="21"/>
+          <w:color w:val="101736"/>
+        </w:rPr>
+        <w:t xml:space="preserve">https://tvist-api-mias-projects-667d1349.vercel.app · agent contract: https://tvist-api-mias-projects-667d1349.vercel.app/skill.md · source: github.com/superheroin888/tvist-api</w:t>
       </w:r>
     </w:p>
     <w:p>

</xml_diff>